<commit_message>
Add English abstract, complete reference metadata, drop unverified sources
Co-Authored-By: Claude Opus 5.5 <noreply@anthropic.com>
Claude-Session: https://claude.ai/code/session_01L3kEfFeLiyRsbpM9fTX2KL
</commit_message>
<xml_diff>
--- a/makale/UYZ_Bagimli_Kullanim_Makale_N43.docx
+++ b/makale/UYZ_Bagimli_Kullanim_Makale_N43.docx
@@ -49,7 +49,7 @@
           <w:sz w:val="24"/>
           <w:szCs w:val="24"/>
         </w:rPr>
-        <w:t xml:space="preserve">Bu araştırma, öğretmen adaylarının akademik görevlerde üretken yapay zekâya (ÜYZ) bağımlı kullanımını yazılı açıklamalardan hareketle kavramsallaştırmayı amaçlar. Bağımlı kullanım, klinik bağımlılıktan ayrı olarak, öğrencinin ÜYZ'yi kendi bilişsel ve metabilişsel süreçlerinin yerine geçecek biçimde sistematik kullanma eğilimi olarak tanımlandı. Dört aday boyut belirlendi: bilişsel dışsallaştırma, metabilişsel gevşeme ve öz-düzenleme kaybı, eleştirel değerlendirme ve doğrulama eksikliği, bağımsız akademik yetkinlik algısının erozyonu. Nitel betimsel desende yürütülen araştırmada, bir eğitim fakültesindeki 43 gönüllünün 13 açık uçlu soruya verdiği 559 yazılı yanıt yönlendirilmiş nitel içerik analiziyle çözümlendi. Her boyutta gösterge bildirimleri ile sınır bildirimleri ayrıldı. Katılımcıların 26'sı yardım aramada ÜYZ'ye öncelik verdi ve 13'ü insan desteğinden araca kayış bildirdi. Bu iki içerik tek başına gösterge sayılmadı. On sekiz katılımcı çıktıyı sorgulamadan kullandığını bildirdi. Kabul dayanağı olarak çıktıya veya araca yönelik güven yargıları ile görev koşulları öne çıktı. Dış kaynağa başvurmayı veya çalışmayı kaynaklara dayandırmayı beş katılımcı bildirdi ve bunların yalnız üçü belirli bir çıktıyı dış bilgiyle karşılaştırdı. On sekiz katılımcı bir ödevi araçsız tamamlayamayacağını düşündüğü bir an anlattı. On beş katılımcı ise araçsız çalışmayı ek çabayla veya başka kaynakla sürdürebileceğini belirtti. Aracı merkezî konuma yerleştiren altı katılımcıya karşılık 29 katılımcı aracı yardımcı veya bilgi kaynağı olarak tanımladı. Süre aşımı, kullanım artışı ve erişim kesintisine verilen genel tepkiler boyutlara gösterge olarak atanmadı. "Bağımlılık" sözcüğü beş katılımcının yedi yanıtında geçti ve mevcut düzeye ya da zaman içindeki değişime gönderme yaptı. Bulgular, her boyut için veriden türeyen gösterge içeriklerini ve dışarıda tutulan sınır içeriklerini belirleyen bir alan tanımı olarak sunuldu.</w:t>
+        <w:t xml:space="preserve">Bu araştırma, öğretmen adaylarının akademik görevlerde üretken yapay zekâya (ÜYZ) bağımlı kullanımını yazılı açıklamalardan hareketle kavramsallaştırmayı amaçlar. Bağımlı kullanım, klinik bağımlılıktan ayrı olarak, öğrencinin ÜYZ'yi kendi bilişsel ve metabilişsel süreçlerinin yerine geçecek biçimde sistematik kullanma eğilimi olarak tanımlandı. Dört aday boyut belirlendi: bilişsel dışsallaştırma, metabilişsel gevşeme ve öz-düzenleme kaybı, eleştirel değerlendirme ve doğrulama eksikliği, bağımsız akademik yetkinlik algısının erozyonu. Nitel betimsel desende yürütülen araştırmada, bir eğitim fakültesindeki 43 gönüllünün 13 açık uçlu soruya verdiği 559 yazılı yanıt yönlendirilmiş nitel içerik analiziyle çözümlendi. Her boyutta gösterge bildirimleri ile sınır bildirimleri ayrıldı. Katılımcıların 26'sı yardım aramada ÜYZ'ye öncelik verdi ve 13'ü insan desteğinden araca kayış bildirdi. Bu iki içerik tek başına gösterge sayılmadı. On sekiz katılımcı çıktıyı sorgulamadan kullandığını bildirdi. Kabul dayanağı olarak çıktıya veya araca yönelik güven yargıları ile görev koşulları öne çıktı. Dış kaynağa başvurmayı veya çalışmayı kaynaklara dayandırmayı beş katılımcı bildirdi. Bunların yalnız üçü belirli bir çıktıyı dış bilgiyle karşılaştırdı. On sekiz katılımcı bir ödevi araçsız tamamlayamayacağını düşündüğü bir an anlattı. On beş katılımcı ise araçsız çalışmayı ek çabayla veya başka kaynakla sürdürebileceğini belirtti. Aracı merkezî konuma yerleştiren altı katılımcıya karşılık 29 katılımcı aracı yardımcı veya bilgi kaynağı olarak tanımladı. Süre aşımı, kullanım artışı ve erişim kesintisine verilen genel tepkiler boyutlara gösterge olarak atanmadı. "Bağımlılık" sözcüğü beş katılımcının yedi yanıtında geçti ve mevcut düzeye ya da zaman içindeki değişime gönderme yaptı. Bulgular, her boyut için veriden türeyen gösterge içeriklerini ve dışarıda tutulan sınır içeriklerini belirleyen bir alan tanımı olarak sunuldu.</w:t>
       </w:r>
     </w:p>
     <w:p>
@@ -91,6 +91,80 @@
           <w:sz w:val="24"/>
           <w:szCs w:val="24"/>
         </w:rPr>
+        <w:t xml:space="preserve">Abstract</w:t>
+      </w:r>
+    </w:p>
+    <w:p>
+      <w:pPr>
+        <w:spacing w:after="0" w:line="360"/>
+        <w:jc w:val="both"/>
+      </w:pPr>
+      <w:r>
+        <w:rPr>
+          <w:rFonts w:ascii="Times New Roman" w:cs="Times New Roman" w:eastAsia="Times New Roman" w:hAnsi="Times New Roman"/>
+          <w:i/>
+          <w:iCs/>
+          <w:sz w:val="24"/>
+          <w:szCs w:val="24"/>
+        </w:rPr>
+        <w:t xml:space="preserve">Conceptualizing Pre-Service Teachers' Dependent Use of Generative Artificial Intelligence: A Qualitative Inquiry</w:t>
+      </w:r>
+    </w:p>
+    <w:p>
+      <w:pPr>
+        <w:spacing w:after="0" w:line="360"/>
+        <w:ind w:firstLine="709"/>
+        <w:jc w:val="both"/>
+      </w:pPr>
+      <w:r>
+        <w:rPr>
+          <w:rFonts w:ascii="Times New Roman" w:cs="Times New Roman" w:eastAsia="Times New Roman" w:hAnsi="Times New Roman"/>
+          <w:sz w:val="24"/>
+          <w:szCs w:val="24"/>
+        </w:rPr>
+        <w:t xml:space="preserve">This study aims to conceptualize pre-service teachers' dependent use of generative artificial intelligence (GenAI) in academic tasks on the basis of their written accounts. Dependent use was defined, as distinct from clinical addiction, as a tendency to use GenAI systematically in place of one's own cognitive and metacognitive processes. Four candidate dimensions were specified: cognitive offloading, metacognitive laxity and loss of self-regulation, lack of critical evaluation and verification, and erosion of perceived independent academic competence. In this qualitative descriptive study, 559 written responses given by 43 volunteers at a faculty of education to 13 open-ended questions were analyzed through directed qualitative content analysis. Indicator statements and boundary statements were separated within each dimension. Twenty-six participants gave priority to GenAI when seeking help, and 13 reported a shift from human support to the tool. These contents were not treated as indicators on their own. Eighteen participants reported using output without questioning it, mostly on the basis of trust judgments about the output or the tool and of task conditions. Five participants reported consulting external sources, and only three compared a specific output with external information. Eighteen participants described a moment when they thought they could not complete an assignment without the tool, while 15 stated that they could continue with extra effort or other sources. Exceeding planned time, increased use and general reactions to loss of access were not assigned to any dimension. The word "addiction" appeared in seven responses of five participants and referred either to the current level or to change over time. The findings are presented as a domain definition that specifies the data-derived indicator contents and the excluded boundary contents for each dimension.</w:t>
+      </w:r>
+    </w:p>
+    <w:p>
+      <w:pPr>
+        <w:spacing w:after="0" w:line="360"/>
+        <w:jc w:val="both"/>
+      </w:pPr>
+      <w:r>
+        <w:rPr>
+          <w:rFonts w:ascii="Times New Roman" w:cs="Times New Roman" w:eastAsia="Times New Roman" w:hAnsi="Times New Roman"/>
+          <w:i/>
+          <w:iCs/>
+          <w:sz w:val="24"/>
+          <w:szCs w:val="24"/>
+        </w:rPr>
+        <w:t xml:space="preserve">Keywords:</w:t>
+      </w:r>
+      <w:r>
+        <w:rPr>
+          <w:rFonts w:ascii="Times New Roman" w:cs="Times New Roman" w:eastAsia="Times New Roman" w:hAnsi="Times New Roman"/>
+          <w:sz w:val="24"/>
+          <w:szCs w:val="24"/>
+        </w:rPr>
+        <w:t xml:space="preserve"> generative artificial intelligence, dependent use, overreliance, pre-service teachers, qualitative content analysis, domain definition</w:t>
+      </w:r>
+    </w:p>
+    <w:p>
+      <w:pPr>
+        <w:pStyle w:val="Heading1"/>
+        <w:keepNext/>
+        <w:spacing w:after="120" w:before="360" w:line="360"/>
+        <w:jc w:val="center"/>
+      </w:pPr>
+      <w:r>
+        <w:rPr>
+          <w:rFonts w:ascii="Times New Roman" w:cs="Times New Roman" w:eastAsia="Times New Roman" w:hAnsi="Times New Roman"/>
+          <w:b/>
+          <w:bCs/>
+          <w:color w:val="000000"/>
+          <w:sz w:val="24"/>
+          <w:szCs w:val="24"/>
+        </w:rPr>
         <w:t xml:space="preserve">Giriş</w:t>
       </w:r>
     </w:p>
@@ -309,7 +383,7 @@
           <w:sz w:val="24"/>
           <w:szCs w:val="24"/>
         </w:rPr>
-        <w:t xml:space="preserve">Bu boyut için destekli performans ile öğrenme arasındaki ayrım belirleyicidir. Araç kullanılabilir olduğu sürece ürün niteliği veya alıştırma performansı artabilir. Buna karşın araçsız, gecikmeli veya transfer gerektiren ölçümlerde sonuçlar değişmeyebilir ya da düşebilir (Bastani vd., 2025; Fan vd., 2025; Kreijkes vd., 2026; Melanou vd., 2026; Yan vd., 2025). Türkiye'deki bir lisede yürütülen alan deneyi bu ayrımı açık biçimde gösterir. Standart GPT-4 arayüzüyle çalışan öğrencilerin alıştırma performansı %48 arttı. Aynı öğrenciler araçsız sınavda kontrol grubundan %17 daha düşük puan aldı. Yalnız ipucu veren sınırlandırılmış arayüz ise alıştırma performansını %127 artırdı ve araçsız sınavdaki olumsuz etkiyi büyük ölçüde azalttı (Bastani vd., 2025). Bu boyutun ayırt edici içeriği, düşünmenin içsel işinin kime ait olduğudur.</w:t>
+        <w:t xml:space="preserve">Bu boyut için destekli performans ile öğrenme arasındaki ayrım belirleyicidir. Araç kullanılabilir olduğu sürece ürün niteliği veya alıştırma performansı artabilir. Buna karşın araçsız, gecikmeli veya transfer gerektiren ölçümlerde sonuçlar değişmeyebilir ya da düşebilir (Bastani vd., 2025; Fan vd., 2025; Kreijkes vd., 2026; Yan vd., 2025). Türkiye'deki bir lisede yürütülen alan deneyi bu ayrımı açık biçimde gösterir. Standart GPT-4 arayüzüyle çalışan öğrencilerin alıştırma performansı %48 arttı. Aynı öğrenciler araçsız sınavda kontrol grubundan %17 daha düşük puan aldı. Yalnız ipucu veren sınırlandırılmış arayüz ise alıştırma performansını %127 artırdı ve araçsız sınavdaki olumsuz etkiyi büyük ölçüde azalttı (Bastani vd., 2025). Bu boyutun ayırt edici içeriği, düşünmenin içsel işinin kime ait olduğudur.</w:t>
       </w:r>
     </w:p>
     <w:p>
@@ -384,7 +458,7 @@
           <w:sz w:val="24"/>
           <w:szCs w:val="24"/>
         </w:rPr>
-        <w:t xml:space="preserve">Dördüncü aday boyut bağımsız akademik yetkinlik algısının erozyonudur. Boyut, öğrencinin akademik görevi araç olmadan yürütebileceğine ilişkin öznel yetkinlik algısındaki düşüşü kapsar. Dış bilgiye erişim, kişinin kendi bildiğine ilişkin tahminini yükseltebilir. Yapay zekâ desteği, beceri kaybını veya becerinin hiç edinilmemesini kullanıcının fark etmesini güçleştirebilir. ÜYZ yaratıcı öz yeterliği artırırken sahiplik ve faillik duygusunu sarsabilir. Bu alandaki kanıtların çoğu kavramsaldır veya öz bildirime dayanır (Fisher vd., 2015; Habib &amp; Gardiner, 2026; H.-P. Lee vd., 2025; Macnamara vd., 2024). Kesitsel çalışmalar, akademik öz yeterliği yapay zekâya dayanma veya bağımlılıkla doğrudan ya da stres ve beklentiler aracılığıyla ilişkilendirir. Boylamsal bir çalışmada ise olağandan yüksek dayanma, sonraki ölçümde daha düşük algılanan faillikle ilişkili bulundu (Elzeky vd., 2026; Wu &amp; Lu, 2026; S. Zhang vd., 2024). Beceri kaybı ise henüz boylamsal kanıttan çok kuramsal bir risk olarak tartışılmaktadır (Cash vd., 2026; Ganuthula vd., 2026; Macnamara vd., 2024). Bu ayrımlar, araçsız çalışmayı daha zahmetli bulma ile kendi üretimini yetersiz görmenin aynı gösterge sayılmamasını gerektirir. Öznel yetkinlik algısı ölçülen beceriden ayrı bir kanıt alanıdır. Bir andaki algı bildirimi de zaman içindeki bir düşüşü tek başına göstermez.</w:t>
+        <w:t xml:space="preserve">Dördüncü aday boyut bağımsız akademik yetkinlik algısının erozyonudur. Boyut, öğrencinin akademik görevi araç olmadan yürütebileceğine ilişkin öznel yetkinlik algısındaki düşüşü kapsar. Dış bilgiye erişim, kişinin kendi bildiğine ilişkin tahminini yükseltebilir. Yapay zekâ desteği, beceri kaybını veya becerinin hiç edinilmemesini kullanıcının fark etmesini güçleştirebilir. ÜYZ yaratıcı öz yeterliği artırırken sahiplik ve faillik duygusunu sarsabilir. Bu alandaki kanıtların çoğu kavramsaldır veya öz bildirime dayanır (Fisher vd., 2015; Habib &amp; Gardiner, 2026; H.-P. Lee vd., 2025; Macnamara vd., 2024). Kesitsel bir çalışmada akademik öz yeterlik, yapay zekâ bağımlılığıyla doğrudan değil, akademik stres ve performans beklentileri aracılığıyla ilişkili bulundu. Boylamsal bir çalışmada ise olağandan yüksek dayanma, sonraki ölçümde daha düşük algılanan faillikle ilişkili bulundu (Wu &amp; Lu, 2026; S. Zhang vd., 2024). Beceri kaybı ise henüz boylamsal kanıttan çok kuramsal bir risk olarak tartışılmaktadır (Cash vd., 2026; Ganuthula vd., 2026; Macnamara vd., 2024). Bu ayrımlar, araçsız çalışmayı daha zahmetli bulma ile kendi üretimini yetersiz görmenin aynı gösterge sayılmamasını gerektirir. Öznel yetkinlik algısı ölçülen beceriden ayrı bir kanıt alanıdır. Bir andaki algı bildirimi de zaman içindeki bir düşüşü tek başına göstermez.</w:t>
       </w:r>
     </w:p>
     <w:p>
@@ -9169,7 +9243,7 @@
           <w:sz w:val="24"/>
           <w:szCs w:val="24"/>
         </w:rPr>
-        <w:t xml:space="preserve">Apata, O. E., Kwok, O., &amp; Ajose, S. T. (2026). The impact of ChatGPT on higher education: A systematic review of global opportunities, perceptions, and challenges. Journal of Computer Assisted Learning, 42(5), Article [doğrulanacak]. https://doi.org/10.1002/jcal.70309</w:t>
+        <w:t xml:space="preserve">Apata, O. E., Kwok, O., &amp; Ajose, S. T. (2026). The impact of ChatGPT on higher education: A systematic review of global opportunities, perceptions, and challenges. Journal of Computer Assisted Learning, 42(5), Article e70309. https://doi.org/10.1002/jcal.70309</w:t>
       </w:r>
     </w:p>
     <w:p>
@@ -9334,7 +9408,7 @@
           <w:sz w:val="24"/>
           <w:szCs w:val="24"/>
         </w:rPr>
-        <w:t xml:space="preserve">Bıkmaz Bilgen, Ö., &amp; Doğan, N. (2017). Puanlayıcılar arası güvenirlik belirleme tekniklerinin karşılaştırılması. Eğitimde ve Psikolojide Ölçme ve Değerlendirme Dergisi, 8(1), 63–78. [doğrulanacak] https://dergipark.org.tr/en/pub/epod/article/294847</w:t>
+        <w:t xml:space="preserve">Bıkmaz Bilgen, Ö., &amp; Doğan, N. (2017). Puanlayıcılar arası güvenirlik belirleme tekniklerinin karşılaştırılması. Eğitimde ve Psikolojide Ölçme ve Değerlendirme Dergisi, 8(1), 63–78. https://doi.org/10.21031/epod.294847</w:t>
       </w:r>
     </w:p>
     <w:p>
@@ -9409,7 +9483,7 @@
           <w:sz w:val="24"/>
           <w:szCs w:val="24"/>
         </w:rPr>
-        <w:t xml:space="preserve">Campbell, L. O., Frawley, C., Lambie, G. W., Cabrera, K. S., &amp; Vizcarra, B. D. (2025). Examining artificial intelligence policies in counsellor education. Counselling and Psychotherapy Research, 25(1), Article [doğrulanacak]. https://doi.org/10.1002/capr.12880</w:t>
+        <w:t xml:space="preserve">Campbell, L. O., Frawley, C., Lambie, G. W., Cabrera, K. S., &amp; Vizcarra, B. D. (2025). Examining artificial intelligence policies in counsellor education. Counselling and Psychotherapy Research, 25(1), Article e12880. https://doi.org/10.1002/capr.12880</w:t>
       </w:r>
     </w:p>
     <w:p>
@@ -9454,7 +9528,7 @@
           <w:sz w:val="24"/>
           <w:szCs w:val="24"/>
         </w:rPr>
-        <w:t xml:space="preserve">Christou, P. A. (2023). How to use artificial intelligence (AI) as a resource, methodological and analysis tool in qualitative research? The Qualitative Report, 28(7), 1968–1980. [doğrulanacak] https://nsuworks.nova.edu/tqr/vol28/iss7/9/</w:t>
+        <w:t xml:space="preserve">Christou, P. A. (2023). How to use artificial intelligence (AI) as a resource, methodological and analysis tool in qualitative research? The Qualitative Report, 28(7), 1968–1980. https://doi.org/10.46743/2160-3715/2023.6406</w:t>
       </w:r>
     </w:p>
     <w:p>
@@ -9619,21 +9693,6 @@
           <w:sz w:val="24"/>
           <w:szCs w:val="24"/>
         </w:rPr>
-        <w:t xml:space="preserve">Elzeky, M. E., Alanazi, S., Shahine, N. F. M., &amp; Atashzadeh-Shoorideh, F. (2026). Association between ChatGPT reliance, self-directed learning, and problem-solving competencies among nursing students: The mediating role of academic self-efficacy in an analytical cross-sectional design. Nursing Forum, 2026(1), Article [doğrulanacak]. https://doi.org/10.1155/nuf/3301894</w:t>
-      </w:r>
-    </w:p>
-    <w:p>
-      <w:pPr>
-        <w:spacing w:after="0" w:line="360"/>
-        <w:ind w:left="709" w:hanging="709"/>
-        <w:jc w:val="left"/>
-      </w:pPr>
-      <w:r>
-        <w:rPr>
-          <w:rFonts w:ascii="Times New Roman" w:cs="Times New Roman" w:eastAsia="Times New Roman" w:hAnsi="Times New Roman"/>
-          <w:sz w:val="24"/>
-          <w:szCs w:val="24"/>
-        </w:rPr>
         <w:t xml:space="preserve">Eroğlu, A., &amp; Ateş, A. (2025). Türkçe öğretmeni adaylarının ChatGPT kullanım deneyimleri. Sakarya Üniversitesi Eğitim Fakültesi Dergisi, 25(2), 194–223. https://doi.org/10.53629/sakaefd.1797431</w:t>
       </w:r>
     </w:p>
@@ -9664,22 +9723,22 @@
           <w:sz w:val="24"/>
           <w:szCs w:val="24"/>
         </w:rPr>
-        <w:t xml:space="preserve">Farhat, Z. (2026). When AI thinks for us: Unveiling the cognitive and social toll of ChatGPT over-reliance. Applied Cognitive Psychology, 40(3), Article [doğrulanacak]. https://doi.org/10.1002/acp.70205</w:t>
-      </w:r>
-    </w:p>
-    <w:p>
-      <w:pPr>
-        <w:spacing w:after="0" w:line="360"/>
-        <w:ind w:left="709" w:hanging="709"/>
-        <w:jc w:val="left"/>
-      </w:pPr>
-      <w:r>
-        <w:rPr>
-          <w:rFonts w:ascii="Times New Roman" w:cs="Times New Roman" w:eastAsia="Times New Roman" w:hAnsi="Times New Roman"/>
-          <w:sz w:val="24"/>
-          <w:szCs w:val="24"/>
-        </w:rPr>
-        <w:t xml:space="preserve">Farinosi, M., &amp; Melchior, C. (2025). 'I use ChatGPT, but should I?' A multi-method analysis of students' practices and attitudes towards AI in higher education. European Journal of Education, [doğrulanacak], Article [doğrulanacak]. https://doi.org/10.1111/ejed.70094</w:t>
+        <w:t xml:space="preserve">Farhat, Z. (2026). When AI thinks for us: Unveiling the cognitive and social toll of ChatGPT over-reliance. Applied Cognitive Psychology, 40(3), Article e70205. https://doi.org/10.1002/acp.70205</w:t>
+      </w:r>
+    </w:p>
+    <w:p>
+      <w:pPr>
+        <w:spacing w:after="0" w:line="360"/>
+        <w:ind w:left="709" w:hanging="709"/>
+        <w:jc w:val="left"/>
+      </w:pPr>
+      <w:r>
+        <w:rPr>
+          <w:rFonts w:ascii="Times New Roman" w:cs="Times New Roman" w:eastAsia="Times New Roman" w:hAnsi="Times New Roman"/>
+          <w:sz w:val="24"/>
+          <w:szCs w:val="24"/>
+        </w:rPr>
+        <w:t xml:space="preserve">Farinosi, M., &amp; Melchior, C. (2025). 'I use ChatGPT, but should I?' A multi-method analysis of students' practices and attitudes towards AI in higher education. European Journal of Education, 60, Article e70094. https://doi.org/10.1111/ejed.70094</w:t>
       </w:r>
     </w:p>
     <w:p>
@@ -9934,7 +9993,7 @@
           <w:sz w:val="24"/>
           <w:szCs w:val="24"/>
         </w:rPr>
-        <w:t xml:space="preserve">Hosseini, M., Resnik, D. B., &amp; Holmes, K. (2023). The ethics of disclosing the use of artificial intelligence tools in writing scholarly manuscripts. Research Ethics, [doğrulanacak], [doğrulanacak]. https://doi.org/10.1177/17470161231180449</w:t>
+        <w:t xml:space="preserve">Hosseini, M., Resnik, D. B., &amp; Holmes, K. (2023). The ethics of disclosing the use of artificial intelligence tools in writing scholarly manuscripts. Research Ethics, 19(4), 449–465. https://doi.org/10.1177/17470161231180449</w:t>
       </w:r>
     </w:p>
     <w:p>
@@ -9964,7 +10023,7 @@
           <w:sz w:val="24"/>
           <w:szCs w:val="24"/>
         </w:rPr>
-        <w:t xml:space="preserve">Hou, I., Man, O., Hamilton, K., Muthusekaran, S., Johnykutty, J., Zadeh, L., &amp; MacNeil, S. (2025). "All roads lead to ChatGPT": How generative AI is eroding social interactions and student learning communities. In Proceedings of the 30th ACM Conference on Innovation and Technology in Computer Science Education V. 1 (pp. [doğrulanacak]). Association for Computing Machinery. https://doi.org/10.1145/3724363.3729024</w:t>
+        <w:t xml:space="preserve">Hou, I., Man, O., Hamilton, K., Muthusekaran, S., Johnykutty, J., Zadeh, L., &amp; MacNeil, S. (2025). "All roads lead to ChatGPT": How generative AI is eroding social interactions and student learning communities. In Proceedings of the 30th ACM Conference on Innovation and Technology in Computer Science Education V. 1 (pp. 79–85). Association for Computing Machinery. https://doi.org/10.1145/3724363.3729024</w:t>
       </w:r>
     </w:p>
     <w:p>
@@ -10039,22 +10098,22 @@
           <w:sz w:val="24"/>
           <w:szCs w:val="24"/>
         </w:rPr>
-        <w:t xml:space="preserve">Jooste, J. L., Wolff, K. E., &amp; Joubert, J. G. (2025). Engineering students' perceptions and use of generative artificial intelligence. Computer Applications in Engineering Education, 33(4), Article [doğrulanacak]. https://doi.org/10.1002/cae.70064</w:t>
-      </w:r>
-    </w:p>
-    <w:p>
-      <w:pPr>
-        <w:spacing w:after="0" w:line="360"/>
-        <w:ind w:left="709" w:hanging="709"/>
-        <w:jc w:val="left"/>
-      </w:pPr>
-      <w:r>
-        <w:rPr>
-          <w:rFonts w:ascii="Times New Roman" w:cs="Times New Roman" w:eastAsia="Times New Roman" w:hAnsi="Times New Roman"/>
-          <w:sz w:val="24"/>
-          <w:szCs w:val="24"/>
-        </w:rPr>
-        <w:t xml:space="preserve">Kalenda, P. J., Rath, L., Abugasea Heidt, M., &amp; Wright, A. (2025). Pre-service teacher perceptions of ChatGPT for lesson plan generation. Journal of Educational Technology Systems, [doğrulanacak], [doğrulanacak]. https://doi.org/10.1177/00472395241301388</w:t>
+        <w:t xml:space="preserve">Jooste, J. L., Wolff, K. E., &amp; Joubert, J. G. (2025). Engineering students' perceptions and use of generative artificial intelligence. Computer Applications in Engineering Education, 33(4), Article e70064. https://doi.org/10.1002/cae.70064</w:t>
+      </w:r>
+    </w:p>
+    <w:p>
+      <w:pPr>
+        <w:spacing w:after="0" w:line="360"/>
+        <w:ind w:left="709" w:hanging="709"/>
+        <w:jc w:val="left"/>
+      </w:pPr>
+      <w:r>
+        <w:rPr>
+          <w:rFonts w:ascii="Times New Roman" w:cs="Times New Roman" w:eastAsia="Times New Roman" w:hAnsi="Times New Roman"/>
+          <w:sz w:val="24"/>
+          <w:szCs w:val="24"/>
+        </w:rPr>
+        <w:t xml:space="preserve">Kalenda, P. J., Rath, L., Abugasea Heidt, M., &amp; Wright, A. (2025). Pre-service teacher perceptions of ChatGPT for lesson plan generation. Journal of Educational Technology Systems, 53(3), 219–241. https://doi.org/10.1177/00472395241301388</w:t>
       </w:r>
     </w:p>
     <w:p>
@@ -10129,7 +10188,7 @@
           <w:sz w:val="24"/>
           <w:szCs w:val="24"/>
         </w:rPr>
-        <w:t xml:space="preserve">Khalid, S., Ifran, S., Huang, X., Tadesse, E., &amp; Dainkun, J. (2026). AI-integrated professional development for pre-service teachers: A systematic review of impacts on pedagogical strategies and technological self-efficacy. European Journal of Education, 61(2), Article [doğrulanacak]. https://doi.org/10.1111/ejed.70547</w:t>
+        <w:t xml:space="preserve">Khalid, S., Ifran, S., Huang, X., Tadesse, E., &amp; Dainkun, J. (2026). AI-integrated professional development for pre-service teachers: A systematic review of impacts on pedagogical strategies and technological self-efficacy. European Journal of Education, 61(2), Article e70547. https://doi.org/10.1111/ejed.70547</w:t>
       </w:r>
     </w:p>
     <w:p>
@@ -10249,7 +10308,7 @@
           <w:sz w:val="24"/>
           <w:szCs w:val="24"/>
         </w:rPr>
-        <w:t xml:space="preserve">Krupp, L., Steinert, S., Kiefer-Emmanouilidis, M., Avila, K. E., Lukowicz, P., Kuhn, J., Küchemann, S., &amp; Karolus, J. (2024). Unreflected acceptance – Investigating the negative consequences of ChatGPT-assisted problem solving in physics education. In HHAI 2024: Hybrid human AI systems for the social good (Frontiers in Artificial Intelligence and Applications, Vol. [doğrulanacak], pp. [doğrulanacak]). IOS Press. https://doi.org/10.3233/FAIA240195</w:t>
+        <w:t xml:space="preserve">Krupp, L., Steinert, S., Kiefer-Emmanouilidis, M., Avila, K. E., Lukowicz, P., Kuhn, J., Küchemann, S., &amp; Karolus, J. (2024). Unreflected acceptance – Investigating the negative consequences of ChatGPT-assisted problem solving in physics education. In HHAI 2024: Hybrid human AI systems for the social good (Frontiers in Artificial Intelligence and Applications, Vol. [doğrulanacak], pp. 199–212). IOS Press. https://doi.org/10.3233/FAIA240195</w:t>
       </w:r>
     </w:p>
     <w:p>
@@ -10339,7 +10398,7 @@
           <w:sz w:val="24"/>
           <w:szCs w:val="24"/>
         </w:rPr>
-        <w:t xml:space="preserve">Lehtinen, A., Channa, F., Näykki, P., Ahlström, E., &amp; Hiljanen, M. (2026). Generative AI for collaborative learning: Fostering critical thinking in teacher education. Journal of Computer Assisted Learning, 42(3), Article [doğrulanacak]. https://doi.org/10.1002/jcal.70256</w:t>
+        <w:t xml:space="preserve">Lehtinen, A., Channa, F., Näykki, P., Ahlström, E., &amp; Hiljanen, M. (2026). Generative AI for collaborative learning: Fostering critical thinking in teacher education. Journal of Computer Assisted Learning, 42(3), Article e70256. https://doi.org/10.1002/jcal.70256</w:t>
       </w:r>
     </w:p>
     <w:p>
@@ -10384,7 +10443,7 @@
           <w:sz w:val="24"/>
           <w:szCs w:val="24"/>
         </w:rPr>
-        <w:t xml:space="preserve">Long, D., &amp; Magerko, B. (2020). What is AI literacy? Competencies and design considerations. In Proceedings of the 2020 CHI Conference on Human Factors in Computing Systems (pp. [doğrulanacak]). Association for Computing Machinery. https://doi.org/10.1145/3313831.3376727</w:t>
+        <w:t xml:space="preserve">Long, D., &amp; Magerko, B. (2020). What is AI literacy? Competencies and design considerations. In Proceedings of the 2020 CHI Conference on Human Factors in Computing Systems (pp. 1–16). Association for Computing Machinery. https://doi.org/10.1145/3313831.3376727</w:t>
       </w:r>
     </w:p>
     <w:p>
@@ -10489,21 +10548,6 @@
           <w:sz w:val="24"/>
           <w:szCs w:val="24"/>
         </w:rPr>
-        <w:t xml:space="preserve">Melanou, C., Beege, M., &amp; Kimmig, M. (2026). Generative AI and learning dynamics in higher education: A longitudinal empirical study. Journal of Computer Assisted Learning, 42(5), Article [doğrulanacak]. https://doi.org/10.1002/jcal.70322</w:t>
-      </w:r>
-    </w:p>
-    <w:p>
-      <w:pPr>
-        <w:spacing w:after="0" w:line="360"/>
-        <w:ind w:left="709" w:hanging="709"/>
-        <w:jc w:val="left"/>
-      </w:pPr>
-      <w:r>
-        <w:rPr>
-          <w:rFonts w:ascii="Times New Roman" w:cs="Times New Roman" w:eastAsia="Times New Roman" w:hAnsi="Times New Roman"/>
-          <w:sz w:val="24"/>
-          <w:szCs w:val="24"/>
-        </w:rPr>
         <w:t xml:space="preserve">Melumad, S., &amp; Yun, J. H. (2025). Experimental evidence of the effects of large language models versus web search on depth of learning. PNAS Nexus, 4(10), Article pgaf316. https://doi.org/10.1093/pnasnexus/pgaf316</w:t>
       </w:r>
     </w:p>
@@ -10519,7 +10563,7 @@
           <w:sz w:val="24"/>
           <w:szCs w:val="24"/>
         </w:rPr>
-        <w:t xml:space="preserve">Merzifonluoglu, A., &amp; Gunes, H. (2025). Shifting dynamics: Who holds the reins in decision-making with artificial intelligence tools? Perspectives of Gen Z pre-service teachers. European Journal of Education, [doğrulanacak], Article [doğrulanacak]. https://doi.org/10.1111/ejed.70053</w:t>
+        <w:t xml:space="preserve">Merzifonluoglu, A., &amp; Gunes, H. (2025). Shifting dynamics: Who holds the reins in decision-making with artificial intelligence tools? Perspectives of Gen Z pre-service teachers. European Journal of Education, 60(1), Article [doğrulanacak]. https://doi.org/10.1111/ejed.70053</w:t>
       </w:r>
     </w:p>
     <w:p>
@@ -10864,7 +10908,7 @@
           <w:sz w:val="24"/>
           <w:szCs w:val="24"/>
         </w:rPr>
-        <w:t xml:space="preserve">Sangka, K. B., Pratama, R. D., Hidayat, R. W., &amp; Fashoto, S. G. (2025). Redefining education in the digital age: The role of GPT models in academic fraud and logistics. Human Behavior and Emerging Technologies, 2025(1), Article [doğrulanacak]. https://doi.org/10.1155/hbe2/7118205</w:t>
+        <w:t xml:space="preserve">Sangka, K. B., Pratama, R. D., &amp; Hidayat, R. W. (2025). Redefining education in the digital age: The role of GPT models in academic fraud and logistics. Human Behavior and Emerging Technologies, 2025(1), Article [doğrulanacak]. https://doi.org/10.1155/hbe2/7118205</w:t>
       </w:r>
     </w:p>
     <w:p>
@@ -10969,7 +11013,7 @@
           <w:sz w:val="24"/>
           <w:szCs w:val="24"/>
         </w:rPr>
-        <w:t xml:space="preserve">Su, C. S., Hsu, C. C., &amp; González Campos, J. A. (2026). ChatGPT as a resource to strengthen mathematics teaching and learning: A systematic review. Journal of Computer Assisted Learning, 42(3), Article [doğrulanacak]. https://doi.org/10.1002/jcal.70241</w:t>
+        <w:t xml:space="preserve">Su, C. S., Hsu, C. C., &amp; González Campos, J. A. (2026). ChatGPT as a resource to strengthen mathematics teaching and learning: A systematic review. Journal of Computer Assisted Learning, 42(3), Article e70241. https://doi.org/10.1002/jcal.70241</w:t>
       </w:r>
     </w:p>
     <w:p>
@@ -11239,7 +11283,7 @@
           <w:sz w:val="24"/>
           <w:szCs w:val="24"/>
         </w:rPr>
-        <w:t xml:space="preserve">Zhang, H., Wu, C., Xie, J., Lyu, Y., Cai, J., &amp; Carroll, J. M. (2025). Harnessing the power of AI in qualitative research: Exploring, using and redesigning ChatGPT. Computers in Human Behavior: Artificial Humans, 4, Article 100144. [doğrulanacak] https://www.sciencedirect.com/science/article/pii/S2949882125000283</w:t>
+        <w:t xml:space="preserve">Zhang, H., Wu, C., Xie, J., Lyu, Y., Cai, J., &amp; Carroll, J. M. (2025). Harnessing the power of AI in qualitative research: Exploring, using and redesigning ChatGPT. Computers in Human Behavior: Artificial Humans, 4, Article 100144. https://doi.org/10.1016/j.chbah.2025.100144</w:t>
       </w:r>
     </w:p>
     <w:p>

</xml_diff>

<commit_message>
Add version comparison report; correct coding and K40 claims in N43 draft
Co-Authored-By: Claude Opus 5.5 <noreply@anthropic.com>
Claude-Session: https://claude.ai/code/session_01L3kEfFeLiyRsbpM9fTX2KL
</commit_message>
<xml_diff>
--- a/makale/UYZ_Bagimli_Kullanim_Makale_N43.docx
+++ b/makale/UYZ_Bagimli_Kullanim_Makale_N43.docx
@@ -669,7 +669,7 @@
           <w:sz w:val="24"/>
           <w:szCs w:val="24"/>
         </w:rPr>
-        <w:t xml:space="preserve">Çalışma grubunu bir üniversitenin eğitim fakültesinde öğrenim gören 43 gönüllü öğrenci oluşturdu. Katılımcıların 41'i lisans düzeyinde öğretmen adayıdır. Bu katılımcıların programlara göre dağılımı şöyledir: sınıf öğretmenliği 11, sosyal bilgiler öğretmenliği 9, okul öncesi öğretmenliği 8, rehberlik ve psikolojik danışmanlık 6, ilköğretim matematik öğretmenliği 4, Türkçe öğretmenliği 2 ve fen bilgisi öğretmenliği 1. İki katılımcı eğitimde ölçme ve değerlendirme alanında yüksek lisans öğrencisidir. Bu iki katılımcı aynı formu aynı uygulama kapsamında doldurdu ve açıklamaları akademik ödev bağlamına gönderme yapar. Bu nedenle iki formu analize dâhil ettik. Katılımcılar 19-36 yaş aralığındadır ve ortanca yaş 22'dir. Farklı programlardan açıklama incelemek veri çeşitliliğini artırdı. Ancak programlar veya öğrenim düzeyleri arasında karşılaştırmalı sonuç üretmedik. Katılımcı kodları (K01-K43) form dosyalarındaki sırayla verildi. [YAZAR BİLGİSİ GEREKLİ: Örnekleme yolu, uygulama tarihleri ve kurumun anonim tanımı.]</w:t>
+        <w:t xml:space="preserve">Çalışma grubunu bir üniversitenin eğitim fakültesinde öğrenim gören 43 gönüllü öğrenci oluşturdu. Katılımcıların 41'i lisans düzeyinde öğretmen adayıdır. Bu katılımcıların programlara göre dağılımı şöyledir: sınıf öğretmenliği 11, sosyal bilgiler öğretmenliği 9, okul öncesi öğretmenliği 8, rehberlik ve psikolojik danışmanlık 6, ilköğretim matematik öğretmenliği 4, Türkçe öğretmenliği 2 ve fen bilgisi öğretmenliği 1. İki katılımcı ise program alanına eğitimde ölçme ve değerlendirmeyi yazdı. Bunlardan K41 yüksek lisans öğrencisi olduğunu açıkça belirtti. K40 öğrenim düzeyini yazmadı, ancak bir yanıtında psikolojik danışman olduğunu belirtti. Bu nedenle K40'ın lisansüstü düzeyde olduğu bir çıkarımdır. Bu iki katılımcı aynı formu aynı uygulama kapsamında doldurdu ve açıklamaları akademik ödev bağlamına gönderme yapar. Bu nedenle iki formu analize dâhil ettik. Katılımcılar 19-36 yaş aralığındadır ve ortanca yaş 22'dir. Farklı programlardan açıklama incelemek veri çeşitliliğini artırdı. Ancak programlar veya öğrenim düzeyleri arasında karşılaştırmalı sonuç üretmedik. Katılımcı kodları (K01-K43) form dosyalarındaki sırayla verildi. [YAZAR BİLGİSİ GEREKLİ: Örnekleme yolu, uygulama tarihleri ve kurumun anonim tanımı.]</w:t>
       </w:r>
     </w:p>
     <w:p>
@@ -872,7 +872,7 @@
           <w:sz w:val="24"/>
           <w:szCs w:val="24"/>
         </w:rPr>
-        <w:t xml:space="preserve">Form sorularının güçlük ve düzenleme içeriğine ağırlık vermesini, bu bildirimleri öne çıkarabilecek bir yorum eğilimi olarak değerlendirdik. Bu eğilimi dengelemek için açık retleri, araçsız çalışmayı sürdürebilme açıklamalarını ve yardım kaynaklarının birlikte kullanıldığı örnekleri analizde koruduk. Katılımcı teyidi ve farklı veri türlerine dayalı çeşitleme yapmadık. Kodlama ve nihai sınıflandırma kararlarını araştırmacılar olarak biz verdik. Analiz ve yazım sürecinde Claude ve ChatGPT'den aday kod önerisi, önceki kararlarla karşılaştırma, matris biçimlendirme, alıntı ve frekans denetimi, kaynak tarama ve dil düzenleme amacıyla yararlandık (Christou, 2023; Hosseini vd., 2023; Resnik &amp; Hosseini, 2025). Büyük dil modelleri betimsel kodlamada makul sonuçlar verebilir, ancak ince yorumlayıcı temaları yakalamada zayıf kalır ve insan kodlayıcıların temalarıyla yalnız kısmen örtüşür (Hamilton vd., 2023; Hitch, 2024; Morgan, 2023; H. Zhang vd., 2025). Bu nedenle model önerilerini yalnız kaynak yanıtları yeniden incelemek için kullandık ve nihai kodları insan kodlaması ve uzlaşı süreciyle belirledik. Modellere katılımcı yanıtları kimlik bilgisi içermeyen biçimde, K kodlarıyla aktarıldı. [YAZAR BİLGİSİ GEREKLİ: Model sürümleri ve kullanım tarihleri; etik onayın bu işlemeyi kapsayıp kapsamadığı.] [YAZAR BİLGİSİ GEREKLİ: Etik kurul adı, karar tarihi ve sayısı; araştırmacıların katılımcılarla ilişkisi (ör. aynı fakültede ders verip vermedikleri); verilerin toplandığı tez çalışmasıyla ilişki.]</w:t>
+        <w:t xml:space="preserve">Form sorularının güçlük ve düzenleme içeriğine ağırlık vermesini, bu bildirimleri öne çıkarabilecek bir yorum eğilimi olarak değerlendirdik. Bu eğilimi dengelemek için açık retleri, araçsız çalışmayı sürdürebilme açıklamalarını ve yardım kaynaklarının birlikte kullanıldığı örnekleri analizde koruduk. Katılımcı teyidi ve farklı veri türlerine dayalı çeşitleme yapmadık. Kodlama ve nihai sınıflandırma kararlarını araştırmacılar olarak biz verdik. Analiz ve yazım sürecinde Claude ve ChatGPT'den aday kod önerisi, önceki kararlarla karşılaştırma, matris biçimlendirme, alıntı ve frekans denetimi, kaynak tarama ve dil düzenleme amacıyla yararlandık (Christou, 2023; Hosseini vd., 2023; Resnik &amp; Hosseini, 2025). Büyük dil modelleri betimsel kodlamada makul sonuçlar verebilir, ancak ince yorumlayıcı temaları yakalamada zayıf kalır ve insan kodlayıcıların temalarıyla yalnız kısmen örtüşür (Hamilton vd., 2023; Hitch, 2024; Morgan, 2023; H. Zhang vd., 2025). Bu nedenle model önerilerini yalnız kaynak yanıtları yeniden incelemek için kullandık. İlk 41 formun kodları insan kodlaması ve uzlaşı süreciyle belirlendi. [YAZAR NOTU: K40 ve K41 formlarının kodları bu revizyonda önerildi; iki araştırmacının bağımsız kodlaması tamamlanmadan bu cümle bütün veri kümesini kapsayacak biçimde yazılmamalıdır.] Modellere katılımcı yanıtları kimlik bilgisi içermeyen biçimde, K kodlarıyla aktarıldı. [YAZAR BİLGİSİ GEREKLİ: Model sürümleri ve kullanım tarihleri; etik onayın bu işlemeyi kapsayıp kapsamadığı.] [YAZAR BİLGİSİ GEREKLİ: Etik kurul adı, karar tarihi ve sayısı; araştırmacıların katılımcılarla ilişkisi (ör. aynı fakültede ders verip vermedikleri); verilerin toplandığı tez çalışmasıyla ilişki.]</w:t>
       </w:r>
     </w:p>
     <w:p>
@@ -9119,7 +9119,7 @@
           <w:sz w:val="24"/>
           <w:szCs w:val="24"/>
         </w:rPr>
-        <w:t xml:space="preserve">Yapay zekâ kullanımı: Kodlama kararlarını Yöntem bölümünde açıklanan insan kodlaması ve uzlaşı süreciyle aldık. Claude ve ChatGPT'den aday kod önerisi, karar karşılaştırması, alıntı ve frekans denetimi, kaynak tarama, taslak metin oluşturma, dil düzenleme ve belge hazırlama amacıyla yararlandık. Metnin doğruluğu, yorumların bilimsel dayanakları ve çalışmanın özgünlüğüne ilişkin sorumluluk yazarlara aittir. [YAZAR BİLGİSİ GEREKLİ: Model sürümleri ve kullanım tarihleri.]</w:t>
+        <w:t xml:space="preserve">Yapay zekâ kullanımı: İlk 41 formun kodlama kararlarını Yöntem bölümünde açıklanan insan kodlaması ve uzlaşı süreciyle aldık. K40 ve K41 formları için model destekli önerilen kodlar yazarların bağımsız kodlamasıyla doğrulanmalıdır [YAZAR NOTU]. Claude ve ChatGPT'den aday kod önerisi, karar karşılaştırması, alıntı ve frekans denetimi, kaynak tarama, taslak metin oluşturma, dil düzenleme ve belge hazırlama amacıyla yararlandık. Metnin doğruluğu, yorumların bilimsel dayanakları ve çalışmanın özgünlüğüne ilişkin sorumluluk yazarlara aittir. [YAZAR BİLGİSİ GEREKLİ: Model sürümleri ve kullanım tarihleri.]</w:t>
       </w:r>
     </w:p>
     <w:p>

</xml_diff>